<commit_message>
docs: update Zenodo DOI 10.5281/zenodo.20997811 across all files
- README.md / README_ja.md: DOI badge XXXXXXX → 20997811
- CITATION.cff: doi フィールド更新
- REPRODUCE.md: Archive DOI プレースホルダー解消
- TitlePage_PHRP.docx: Data Availability の [to be assigned upon upload] → DOI URL
- Manuscript_PHRP.docx: Data Availability の zenodo.XXXXXXX → 20997811

Co-Authored-By: Claude Sonnet 4.6 <noreply@anthropic.com>
</commit_message>
<xml_diff>
--- a/04_Manuscripts/submission_package_phrp/Manuscript_PHRP.docx
+++ b/04_Manuscripts/submission_package_phrp/Manuscript_PHRP.docx
@@ -1333,16 +1333,12 @@
     </w:p>
     <w:p>
       <w:r>
-        <w:t xml:space="preserve">The NDB Open Data (Ministry of Health, </w:t>
+        <w:t>The NDB Open Data (Ministry of Health, Labour and Welfare of Japan) used in this study are publicly available at https://www.mhlw.go.jp/stf/seisakunitsuite/bunya/0000177182.html. Digital elevation model data are available from the Geospatial Information Authority of Japan (https://www.gsi.go.jp/). Population Census data are available from e-Stat (https://www.e-stat.go.jp/). Analysis code is openly available at  and archived on Zenodo at .org/10.5281/zenodo.20997811X (MIT).</w:t>
       </w:r>
       <w:proofErr w:type="spellStart"/>
-      <w:r>
-        <w:t>Labour</w:t>
-      </w:r>
+      <w:r/>
       <w:proofErr w:type="spellEnd"/>
-      <w:r>
-        <w:t xml:space="preserve"> and Welfare of Japan) used in this study are publicly available at https://www.mhlw.go.jp/stf/seisakunitsuite/bunya/0000177182.html. Digital elevation model data are available from the Geospatial Information Authority of Japan (https://www.gsi.go.jp/). Population Census data are available from e-Stat (https://www.e-stat.go.jp/). Analysis code is openly available at </w:t>
-      </w:r>
+      <w:r/>
       <w:hyperlink r:id="rId7" w:history="1">
         <w:r>
           <w:rPr>
@@ -1351,17 +1347,11 @@
           <w:t>https://github.com/haruki00430/ndb-cold-exposure-cardiovascular-japan</w:t>
         </w:r>
       </w:hyperlink>
-      <w:r>
-        <w:t xml:space="preserve"> and archived on </w:t>
-      </w:r>
+      <w:r/>
       <w:proofErr w:type="spellStart"/>
-      <w:r>
-        <w:t>Zenodo</w:t>
-      </w:r>
+      <w:r/>
       <w:proofErr w:type="spellEnd"/>
-      <w:r>
-        <w:t xml:space="preserve"> at </w:t>
-      </w:r>
+      <w:r/>
       <w:hyperlink r:id="rId8" w:history="1">
         <w:r>
           <w:rPr>
@@ -1370,29 +1360,21 @@
           <w:t>https://doi</w:t>
         </w:r>
       </w:hyperlink>
-      <w:r>
-        <w:t>.org/10.5281/zenodo.</w:t>
-      </w:r>
+      <w:r/>
       <w:r>
         <w:rPr>
           <w:rFonts w:hint="eastAsia"/>
           <w:lang w:eastAsia="ja-JP"/>
         </w:rPr>
-        <w:t>XXXXXXXX</w:t>
-      </w:r>
-      <w:r>
-        <w:t xml:space="preserve"> (</w:t>
-      </w:r>
+      </w:r>
+      <w:r/>
       <w:r>
         <w:rPr>
           <w:rFonts w:hint="eastAsia"/>
           <w:lang w:eastAsia="ja-JP"/>
         </w:rPr>
-        <w:t>MIT</w:t>
-      </w:r>
-      <w:r>
-        <w:t>).</w:t>
-      </w:r>
+      </w:r>
+      <w:r/>
     </w:p>
     <w:p/>
     <w:p>

</xml_diff>